<commit_message>
feat: embed photo of AWS architecture diagram across report, slides, and web deck
</commit_message>
<xml_diff>
--- a/docs/report/COMP60010_Technical_Consultancy_Report.docx
+++ b/docs/report/COMP60010_Technical_Consultancy_Report.docx
@@ -1656,6 +1656,55 @@
         <w:t>4. Task 3: Target AWS Architecture Design</w:t>
       </w:r>
     </w:p>
+    <w:p/>
+    <w:p>
+      <w:r>
+        <w:drawing>
+          <wp:inline xmlns:a="http://schemas.openxmlformats.org/drawingml/2006/main" xmlns:pic="http://schemas.openxmlformats.org/drawingml/2006/picture">
+            <wp:extent cx="5669280" cy="3164249"/>
+            <wp:docPr id="2" name="Picture 2"/>
+            <wp:cNvGraphicFramePr>
+              <a:graphicFrameLocks noChangeAspect="1"/>
+            </wp:cNvGraphicFramePr>
+            <a:graphic>
+              <a:graphicData uri="http://schemas.openxmlformats.org/drawingml/2006/picture">
+                <pic:pic>
+                  <pic:nvPicPr>
+                    <pic:cNvPr id="0" name="aws_architecture_diagram.jpg"/>
+                    <pic:cNvPicPr/>
+                  </pic:nvPicPr>
+                  <pic:blipFill>
+                    <a:blip r:embed="rId10"/>
+                    <a:stretch>
+                      <a:fillRect/>
+                    </a:stretch>
+                  </pic:blipFill>
+                  <pic:spPr>
+                    <a:xfrm>
+                      <a:off x="0" y="0"/>
+                      <a:ext cx="5669280" cy="3164249"/>
+                    </a:xfrm>
+                    <a:prstGeom prst="rect"/>
+                  </pic:spPr>
+                </pic:pic>
+              </a:graphicData>
+            </a:graphic>
+          </wp:inline>
+        </w:drawing>
+      </w:r>
+    </w:p>
+    <w:p>
+      <w:pPr>
+        <w:jc w:val="center"/>
+      </w:pPr>
+      <w:r>
+        <w:rPr>
+          <w:i/>
+          <w:sz w:val="18"/>
+        </w:rPr>
+        <w:t>Figure 2: Comprehensive Target AWS Cloud Architecture Diagram for CloudFusion Healthcare Analytics Ltd</w:t>
+      </w:r>
+    </w:p>
     <w:p>
       <w:pPr>
         <w:pStyle w:val="Heading2"/>
@@ -2290,7 +2339,7 @@
         <w:drawing>
           <wp:inline xmlns:a="http://schemas.openxmlformats.org/drawingml/2006/main" xmlns:pic="http://schemas.openxmlformats.org/drawingml/2006/picture">
             <wp:extent cx="5486400" cy="3291840"/>
-            <wp:docPr id="2" name="Picture 2"/>
+            <wp:docPr id="3" name="Picture 3"/>
             <wp:cNvGraphicFramePr>
               <a:graphicFrameLocks noChangeAspect="1"/>
             </wp:cNvGraphicFramePr>
@@ -2302,7 +2351,7 @@
                     <pic:cNvPicPr/>
                   </pic:nvPicPr>
                   <pic:blipFill>
-                    <a:blip r:embed="rId10"/>
+                    <a:blip r:embed="rId11"/>
                     <a:stretch>
                       <a:fillRect/>
                     </a:stretch>
@@ -2330,7 +2379,7 @@
           <w:i/>
           <w:sz w:val="18"/>
         </w:rPr>
-        <w:t>Figure 2: Total Cost of Ownership (TCO) Comparison: On-Premises Baseline vs Cloud FinOps</w:t>
+        <w:t>Figure 3: Total Cost of Ownership (TCO) Comparison: On-Premises Baseline vs Cloud FinOps</w:t>
       </w:r>
     </w:p>
     <w:p/>
@@ -2339,7 +2388,7 @@
         <w:drawing>
           <wp:inline xmlns:a="http://schemas.openxmlformats.org/drawingml/2006/main" xmlns:pic="http://schemas.openxmlformats.org/drawingml/2006/picture">
             <wp:extent cx="5029200" cy="3592286"/>
-            <wp:docPr id="3" name="Picture 3"/>
+            <wp:docPr id="4" name="Picture 4"/>
             <wp:cNvGraphicFramePr>
               <a:graphicFrameLocks noChangeAspect="1"/>
             </wp:cNvGraphicFramePr>
@@ -2351,7 +2400,7 @@
                     <pic:cNvPicPr/>
                   </pic:nvPicPr>
                   <pic:blipFill>
-                    <a:blip r:embed="rId11"/>
+                    <a:blip r:embed="rId12"/>
                     <a:stretch>
                       <a:fillRect/>
                     </a:stretch>
@@ -2379,7 +2428,7 @@
           <w:i/>
           <w:sz w:val="18"/>
         </w:rPr>
-        <w:t>Figure 3: Target AWS Architecture Monthly Cost Distribution ($25,176 / month)</w:t>
+        <w:t>Figure 4: Target AWS Architecture Monthly Cost Distribution ($25,176 / month)</w:t>
       </w:r>
     </w:p>
     <w:p>

</xml_diff>